<commit_message>
publish student projects (Fall 2026) 2026-09-22 15:08
</commit_message>
<xml_diff>
--- a/Creative-Tools-Media-Production/greenhouse.docx
+++ b/Creative-Tools-Media-Production/greenhouse.docx
@@ -6,9 +6,9 @@
       <w:pPr>
         <w:pStyle w:val="Heading1"/>
       </w:pPr>
-      <w:bookmarkStart w:id="20" w:name="greenhouse"/>
-      <w:r>
-        <w:t xml:space="preserve">Greenhouse</w:t>
+      <w:bookmarkStart w:id="20" w:name="greenhouse---team18"/>
+      <w:r>
+        <w:t xml:space="preserve">Greenhouse - Team18</w:t>
       </w:r>
       <w:bookmarkEnd w:id="20"/>
     </w:p>
@@ -16,9 +16,9 @@
       <w:pPr>
         <w:pStyle w:val="Heading2"/>
       </w:pPr>
-      <w:bookmarkStart w:id="21" w:name="greenhouse-student-proposal"/>
-      <w:r>
-        <w:t xml:space="preserve">Greenhouse</w:t>
+      <w:bookmarkStart w:id="21" w:name="greenhouse---team18-student-proposal"/>
+      <w:r>
+        <w:t xml:space="preserve">Greenhouse - Team18</w:t>
       </w:r>
       <w:r>
         <w:t xml:space="preserve"> </w:t>

</xml_diff>

<commit_message>
publish student projects (Fall 2026) 2026-09-22 19:39
</commit_message>
<xml_diff>
--- a/Creative-Tools-Media-Production/greenhouse.docx
+++ b/Creative-Tools-Media-Production/greenhouse.docx
@@ -2406,13 +2406,55 @@
         <w:rPr>
           <w:b/>
         </w:rPr>
-        <w:t xml:space="preserve">Recommended composition:</w:t>
-      </w:r>
-      <w:r>
-        <w:t xml:space="preserve"> </w:t>
-      </w:r>
-      <w:r>
-        <w:t xml:space="preserve">6 CS + 2 Design + 1 Art (9) — the authoring surface (scrapbook canvas, on-device handwriting, themes/customization) plus the garden-progression UX is a strong two-designer load, and there is a real authored-art surface (plant art direction/style, themes/backgrounds, the sticker set, the character/profile, the cell-shaded look) that earns one artist (rules: min 1 Design mandated, max 9 total, D+A ≤ 3; see</w:t>
+        <w:t xml:space="preserve">Team composition (set by instructor):</w:t>
+      </w:r>
+      <w:r>
+        <w:t xml:space="preserve"> </w:t>
+      </w:r>
+      <w:r>
+        <w:t xml:space="preserve">6 CS + 1 Design + 0 Art (7) — the authoring surface (scrapbook canvas, on-device handwriting, themes/customization) plus the garden-progression UX is a strong design load, and there is a real authored-art surface (plant art direction/style, themes/backgrounds, the sticker set, the character/profile, the cell-shaded look) — which now has</w:t>
+      </w:r>
+      <w:r>
+        <w:t xml:space="preserve"> </w:t>
+      </w:r>
+      <w:r>
+        <w:rPr>
+          <w:b/>
+        </w:rPr>
+        <w:t xml:space="preserve">no artist</w:t>
+      </w:r>
+      <w:r>
+        <w:t xml:space="preserve">, so the single designer owns all of that Design + UI/UX</w:t>
+      </w:r>
+      <w:r>
+        <w:t xml:space="preserve"> </w:t>
+      </w:r>
+      <w:r>
+        <w:rPr>
+          <w:i/>
+        </w:rPr>
+        <w:t xml:space="preserve">and</w:t>
+      </w:r>
+      <w:r>
+        <w:t xml:space="preserve"> </w:t>
+      </w:r>
+      <w:r>
+        <w:t xml:space="preserve">takes the</w:t>
+      </w:r>
+      <w:r>
+        <w:t xml:space="preserve"> </w:t>
+      </w:r>
+      <w:r>
+        <w:rPr>
+          <w:b/>
+        </w:rPr>
+        <w:t xml:space="preserve">D11 conditional</w:t>
+      </w:r>
+      <w:r>
+        <w:t xml:space="preserve"> </w:t>
+      </w:r>
+      <w:r>
+        <w:t xml:space="preserve">as a real graded Design goal each milestone (M1 Art Proof of Concept / M2 Art Implementation Quality — the last Design goal each milestone), which consumes one Design+UI slot per milestone (rules: min 1 Design mandated, max 9 total, D+A ≤ 3; see</w:t>
       </w:r>
       <w:r>
         <w:t xml:space="preserve"> </w:t>
@@ -2424,7 +2466,37 @@
         <w:t xml:space="preserve">team-formation.pdf</w:t>
       </w:r>
       <w:r>
-        <w:t xml:space="preserve">). If the 3D garden becomes a larger art job, consider trading a designer for a 2nd artist.</w:t>
+        <w:t xml:space="preserve">).</w:t>
+      </w:r>
+      <w:r>
+        <w:t xml:space="preserve"> </w:t>
+      </w:r>
+      <w:r>
+        <w:rPr>
+          <w:b/>
+        </w:rPr>
+        <w:t xml:space="preserve">Load + art-risk flag:</w:t>
+      </w:r>
+      <w:r>
+        <w:t xml:space="preserve"> </w:t>
+      </w:r>
+      <w:r>
+        <w:t xml:space="preserve">this is a heavy squeeze — the authoring/garden UX design load is large for one designer, and a creative journaling app is genuinely art-forward (plant art + themes + sticker set + character + cell-shaded look), so 0 artists is a serious risk. Strongly consider a</w:t>
+      </w:r>
+      <w:r>
+        <w:t xml:space="preserve"> </w:t>
+      </w:r>
+      <w:r>
+        <w:rPr>
+          <w:b/>
+        </w:rPr>
+        <w:t xml:space="preserve">2nd designer</w:t>
+      </w:r>
+      <w:r>
+        <w:t xml:space="preserve"> </w:t>
+      </w:r>
+      <w:r>
+        <w:t xml:space="preserve">and/or an artist within the D+A ≤ 3 cap; if the team stays 6 CS + 1 Design + 0 Art, scope the plant/theme/sticker set hard and lean on a reusable style under D11 (a solo designer + 0 artists is the case the design pool flags, and squeezes the designer's interaction/theme/branding goals).</w:t>
       </w:r>
     </w:p>
     <w:p>
@@ -2492,31 +2564,7 @@
         <w:pStyle w:val="Compact"/>
       </w:pPr>
       <w:r>
-        <w:t xml:space="preserve">M1D3 User Research, Personas &amp; Competitive Analysis (teardown of Forest / Day One / Goodnotes; journaling-habit personas)</w:t>
-      </w:r>
-    </w:p>
-    <w:p>
-      <w:pPr>
-        <w:numPr>
-          <w:ilvl w:val="1"/>
-          <w:numId w:val="1019"/>
-        </w:numPr>
-        <w:pStyle w:val="Compact"/>
-      </w:pPr>
-      <w:r>
-        <w:t xml:space="preserve">M1D5 Interaction &amp; Input Design (drag/pinch/rotate canvas gestures, handwriting input, plant-tending interactions)</w:t>
-      </w:r>
-    </w:p>
-    <w:p>
-      <w:pPr>
-        <w:numPr>
-          <w:ilvl w:val="1"/>
-          <w:numId w:val="1019"/>
-        </w:numPr>
-        <w:pStyle w:val="Compact"/>
-      </w:pPr>
-      <w:r>
-        <w:t xml:space="preserve">M1D8 Narrative, Theme &amp; World Concept (the garden metaphor, themes and the character-profile concept)</w:t>
+        <w:t xml:space="preserve">M1D11 Art Proof of Concept *(conditional — no artist; Design-owned)* — the visual direction: the plant art/style, the themes/backgrounds, the sticker set, the character/profile and the cell-shaded look; 2 mockups. *(The artist's absence + the drop to one designer squeeze out the M1D3/D5/D8 goals.)*</w:t>
       </w:r>
     </w:p>
     <w:p>
@@ -2555,31 +2603,7 @@
         <w:pStyle w:val="Compact"/>
       </w:pPr>
       <w:r>
-        <w:t xml:space="preserve">M2D2 Visual Branding &amp; Style Guide (Greenhouse identity; the theme/sticker system)</w:t>
-      </w:r>
-    </w:p>
-    <w:p>
-      <w:pPr>
-        <w:numPr>
-          <w:ilvl w:val="1"/>
-          <w:numId w:val="1020"/>
-        </w:numPr>
-        <w:pStyle w:val="Compact"/>
-      </w:pPr>
-      <w:r>
-        <w:t xml:space="preserve">M2D5 Playtesting &amp; Iteration Program (journaling-habit retention, authoring friction, garden delight)</w:t>
-      </w:r>
-    </w:p>
-    <w:p>
-      <w:pPr>
-        <w:numPr>
-          <w:ilvl w:val="1"/>
-          <w:numId w:val="1020"/>
-        </w:numPr>
-        <w:pStyle w:val="Compact"/>
-      </w:pPr>
-      <w:r>
-        <w:t xml:space="preserve">M2D8 Game Feel &amp; Feedback Pass — "Juice" (the tactile feel of the canvas, handwriting and growth)</w:t>
+        <w:t xml:space="preserve">M2D11 Art Implementation Quality *(conditional — no artist; Design-owned)* — the plant art, themes/backgrounds, sticker set, character/profile and UI implemented in-engine, no placeholders.</w:t>
       </w:r>
     </w:p>
     <w:p>
@@ -2618,30 +2642,6 @@
     <w:p>
       <w:pPr>
         <w:numPr>
-          <w:ilvl w:val="1"/>
-          <w:numId w:val="1021"/>
-        </w:numPr>
-        <w:pStyle w:val="Compact"/>
-      </w:pPr>
-      <w:r>
-        <w:t xml:space="preserve">M1U2 UX Flows &amp; Wireframes — write → compose → grow → customize journeys.</w:t>
-      </w:r>
-    </w:p>
-    <w:p>
-      <w:pPr>
-        <w:numPr>
-          <w:ilvl w:val="1"/>
-          <w:numId w:val="1021"/>
-        </w:numPr>
-        <w:pStyle w:val="Compact"/>
-      </w:pPr>
-      <w:r>
-        <w:t xml:space="preserve">M1U3 Accessibility &amp; Readability Foundations — legible journal typography, contrast, thumb/stylus targets.</w:t>
-      </w:r>
-    </w:p>
-    <w:p>
-      <w:pPr>
-        <w:numPr>
           <w:ilvl w:val="0"/>
           <w:numId w:val="1018"/>
         </w:numPr>
@@ -2681,30 +2681,6 @@
     <w:p>
       <w:pPr>
         <w:numPr>
-          <w:ilvl w:val="1"/>
-          <w:numId w:val="1022"/>
-        </w:numPr>
-        <w:pStyle w:val="Compact"/>
-      </w:pPr>
-      <w:r>
-        <w:t xml:space="preserve">M2U3 Menu &amp; HUD Motion Design — growth animation, sticker/photo micro-interactions, theme transitions.</w:t>
-      </w:r>
-    </w:p>
-    <w:p>
-      <w:pPr>
-        <w:numPr>
-          <w:ilvl w:val="1"/>
-          <w:numId w:val="1022"/>
-        </w:numPr>
-        <w:pStyle w:val="Compact"/>
-      </w:pPr>
-      <w:r>
-        <w:t xml:space="preserve">M2U5 Mobile UX Adaptation &amp; Ergonomics — one-handed + stylus authoring on the Pixel 9a.</w:t>
-      </w:r>
-    </w:p>
-    <w:p>
-      <w:pPr>
-        <w:numPr>
           <w:ilvl w:val="0"/>
           <w:numId w:val="1018"/>
         </w:numPr>
@@ -2714,49 +2690,13 @@
         <w:rPr>
           <w:b/>
         </w:rPr>
-        <w:t xml:space="preserve">Art M1:</w:t>
-      </w:r>
-      <w:r>
-        <w:t xml:space="preserve"> </w:t>
-      </w:r>
-      <w:r>
-        <w:t xml:space="preserve">1 artist (plant style + themes + stickers + character + UI art)</w:t>
-      </w:r>
-    </w:p>
-    <w:p>
-      <w:pPr>
-        <w:numPr>
-          <w:ilvl w:val="1"/>
-          <w:numId w:val="1023"/>
-        </w:numPr>
-        <w:pStyle w:val="Compact"/>
-      </w:pPr>
-      <w:r>
-        <w:t xml:space="preserve">M1A1 ⭐ Art Direction &amp; Key Mockups (a journal page + the garden)</w:t>
-      </w:r>
-    </w:p>
-    <w:p>
-      <w:pPr>
-        <w:numPr>
-          <w:ilvl w:val="1"/>
-          <w:numId w:val="1023"/>
-        </w:numPr>
-        <w:pStyle w:val="Compact"/>
-      </w:pPr>
-      <w:r>
-        <w:t xml:space="preserve">M1A2 Characters &amp; Plant Style (the profile character + the plant art direction/style guiding the procedural generation)</w:t>
-      </w:r>
-    </w:p>
-    <w:p>
-      <w:pPr>
-        <w:numPr>
-          <w:ilvl w:val="1"/>
-          <w:numId w:val="1023"/>
-        </w:numPr>
-        <w:pStyle w:val="Compact"/>
-      </w:pPr>
-      <w:r>
-        <w:t xml:space="preserve">M1A4 UI Art Concepts &amp; Typography (themes/backgrounds, the sticker set, HUD)</w:t>
+        <w:t xml:space="preserve">Art:</w:t>
+      </w:r>
+      <w:r>
+        <w:t xml:space="preserve"> </w:t>
+      </w:r>
+      <w:r>
+        <w:t xml:space="preserve">0 artists — the authored-art surface (the plant art/style, the themes/backgrounds, the sticker set, the character/profile and the cell-shaded look) is covered by the D11 conditionals, taken as Design goals by the single designer (see Design M1/M2). A creative journaling app is genuinely art-forward, so 0 artists is a serious risk — scope the plant/theme/sticker set hard and lean on a reusable style.</w:t>
       </w:r>
     </w:p>
     <w:p>
@@ -2771,43 +2711,31 @@
         <w:rPr>
           <w:b/>
         </w:rPr>
-        <w:t xml:space="preserve">Art M2:</w:t>
-      </w:r>
-    </w:p>
-    <w:p>
-      <w:pPr>
-        <w:numPr>
-          <w:ilvl w:val="1"/>
-          <w:numId w:val="1024"/>
-        </w:numPr>
-        <w:pStyle w:val="Compact"/>
-      </w:pPr>
-      <w:r>
-        <w:t xml:space="preserve">M2A1 ⭐ Polished Screen Art</w:t>
-      </w:r>
-    </w:p>
-    <w:p>
-      <w:pPr>
-        <w:numPr>
-          <w:ilvl w:val="1"/>
-          <w:numId w:val="1024"/>
-        </w:numPr>
-        <w:pStyle w:val="Compact"/>
-      </w:pPr>
-      <w:r>
-        <w:t xml:space="preserve">M2A4 UI Art — States &amp; Feedback (growth stages, theme states, entry saved)</w:t>
-      </w:r>
-    </w:p>
-    <w:p>
-      <w:pPr>
-        <w:numPr>
-          <w:ilvl w:val="1"/>
-          <w:numId w:val="1024"/>
-        </w:numPr>
-        <w:pStyle w:val="Compact"/>
-      </w:pPr>
-      <w:r>
-        <w:t xml:space="preserve">M2A5 Illustration &amp; Iconography — Full Set (the complete plant/sticker/theme/character art set)</w:t>
+        <w:t xml:space="preserve">TEAM M1:</w:t>
+      </w:r>
+    </w:p>
+    <w:p>
+      <w:pPr>
+        <w:numPr>
+          <w:ilvl w:val="1"/>
+          <w:numId w:val="1023"/>
+        </w:numPr>
+        <w:pStyle w:val="Compact"/>
+      </w:pPr>
+      <w:r>
+        <w:t xml:space="preserve">M1TA1 ⭐ Overall Audio Experience — light UI/ambient SFX and calming BGM from the week-5 needs list, present &amp; working in the prototype (entry saved, plant grows, sticker placed), suitable and correctly triggered. Audio is not load-bearing here — a lecturer scope waiver may apply.</w:t>
+      </w:r>
+    </w:p>
+    <w:p>
+      <w:pPr>
+        <w:numPr>
+          <w:ilvl w:val="1"/>
+          <w:numId w:val="1023"/>
+        </w:numPr>
+        <w:pStyle w:val="Compact"/>
+      </w:pPr>
+      <w:r>
+        <w:t xml:space="preserve">M1TA2 ⭐ Audio Engine Functionality — data-driven audio pipeline (add/replace files without recompiling) + reliable multi-channel playback for overlapping UI SFX.</w:t>
       </w:r>
     </w:p>
     <w:p>
@@ -2822,45 +2750,6 @@
         <w:rPr>
           <w:b/>
         </w:rPr>
-        <w:t xml:space="preserve">TEAM M1:</w:t>
-      </w:r>
-    </w:p>
-    <w:p>
-      <w:pPr>
-        <w:numPr>
-          <w:ilvl w:val="1"/>
-          <w:numId w:val="1025"/>
-        </w:numPr>
-        <w:pStyle w:val="Compact"/>
-      </w:pPr>
-      <w:r>
-        <w:t xml:space="preserve">M1TA1 ⭐ Overall Audio Experience — light UI/ambient SFX and calming BGM from the week-5 needs list, present &amp; working in the prototype (entry saved, plant grows, sticker placed), suitable and correctly triggered. Audio is not load-bearing here — a lecturer scope waiver may apply.</w:t>
-      </w:r>
-    </w:p>
-    <w:p>
-      <w:pPr>
-        <w:numPr>
-          <w:ilvl w:val="1"/>
-          <w:numId w:val="1025"/>
-        </w:numPr>
-        <w:pStyle w:val="Compact"/>
-      </w:pPr>
-      <w:r>
-        <w:t xml:space="preserve">M1TA2 ⭐ Audio Engine Functionality — data-driven audio pipeline (add/replace files without recompiling) + reliable multi-channel playback for overlapping UI SFX.</w:t>
-      </w:r>
-    </w:p>
-    <w:p>
-      <w:pPr>
-        <w:numPr>
-          <w:ilvl w:val="0"/>
-          <w:numId w:val="1018"/>
-        </w:numPr>
-        <w:pStyle w:val="Compact"/>
-      </w:pPr>
-      <w:r>
-        <w:rPr>
-          <w:b/>
-        </w:rPr>
         <w:t xml:space="preserve">TEAM M2:</w:t>
       </w:r>
     </w:p>
@@ -2868,7 +2757,7 @@
       <w:pPr>
         <w:numPr>
           <w:ilvl w:val="1"/>
-          <w:numId w:val="1026"/>
+          <w:numId w:val="1024"/>
         </w:numPr>
         <w:pStyle w:val="Compact"/>
       </w:pPr>
@@ -2880,7 +2769,7 @@
       <w:pPr>
         <w:numPr>
           <w:ilvl w:val="1"/>
-          <w:numId w:val="1026"/>
+          <w:numId w:val="1024"/>
         </w:numPr>
         <w:pStyle w:val="Compact"/>
       </w:pPr>
@@ -2892,7 +2781,7 @@
       <w:pPr>
         <w:numPr>
           <w:ilvl w:val="1"/>
-          <w:numId w:val="1026"/>
+          <w:numId w:val="1024"/>
         </w:numPr>
         <w:pStyle w:val="Compact"/>
       </w:pPr>
@@ -3240,12 +3129,6 @@
     <w:abstractNumId w:val="991"/>
   </w:num>
   <w:num w:numId="1024">
-    <w:abstractNumId w:val="991"/>
-  </w:num>
-  <w:num w:numId="1025">
-    <w:abstractNumId w:val="991"/>
-  </w:num>
-  <w:num w:numId="1026">
     <w:abstractNumId w:val="991"/>
   </w:num>
 </w:numbering>

</xml_diff>